<commit_message>
docs: atualiza README e modelagem com view, triggers e constraints
</commit_message>
<xml_diff>
--- a/docs/ReFood_MER_DER.docx
+++ b/docs/ReFood_MER_DER.docx
@@ -829,6 +829,104 @@
                 <w:szCs w:val="17"/>
               </w:rPr>
               <w:t xml:space="preserve">Data e hora de criação do registro</w:t>
+            </w:r>
+          </w:p>
+        </w:tc>
+      </w:tr>
+      <w:tr>
+        <w:tc>
+          <w:tcPr>
+            <w:tcW w:type="dxa" w:w="1900"/>
+            <w:tcBorders>
+              <w:top w:val="single" w:color="C8E6D4" w:sz="4"/>
+              <w:left w:val="single" w:color="C8E6D4" w:sz="4"/>
+              <w:bottom w:val="single" w:color="C8E6D4" w:sz="4"/>
+              <w:right w:val="single" w:color="C8E6D4" w:sz="4"/>
+            </w:tcBorders>
+            <w:shd w:fill="FFFFFF" w:val="clear"/>
+            <w:tcMar>
+              <w:top w:type="dxa" w:w="80"/>
+              <w:left w:type="dxa" w:w="120"/>
+              <w:bottom w:type="dxa" w:w="80"/>
+              <w:right w:type="dxa" w:w="120"/>
+            </w:tcMar>
+            <w:vAlign w:val="center"/>
+          </w:tcPr>
+          <w:p>
+            <w:r>
+              <w:rPr>
+                <w:rFonts w:ascii="Consolas" w:cs="Consolas" w:eastAsia="Consolas" w:hAnsi="Consolas"/>
+                <w:b/>
+                <w:bCs/>
+                <w:color w:val="2D6A4F"/>
+                <w:sz w:val="17"/>
+                <w:szCs w:val="17"/>
+              </w:rPr>
+              <w:t xml:space="preserve">atualizado_em</w:t>
+            </w:r>
+          </w:p>
+        </w:tc>
+        <w:tc>
+          <w:tcPr>
+            <w:tcW w:type="dxa" w:w="1900"/>
+            <w:tcBorders>
+              <w:top w:val="single" w:color="C8E6D4" w:sz="4"/>
+              <w:left w:val="single" w:color="C8E6D4" w:sz="4"/>
+              <w:bottom w:val="single" w:color="C8E6D4" w:sz="4"/>
+              <w:right w:val="single" w:color="C8E6D4" w:sz="4"/>
+            </w:tcBorders>
+            <w:shd w:fill="FFFFFF" w:val="clear"/>
+            <w:tcMar>
+              <w:top w:type="dxa" w:w="80"/>
+              <w:left w:type="dxa" w:w="120"/>
+              <w:bottom w:type="dxa" w:w="80"/>
+              <w:right w:type="dxa" w:w="120"/>
+            </w:tcMar>
+            <w:vAlign w:val="center"/>
+          </w:tcPr>
+          <w:p>
+            <w:r>
+              <w:rPr>
+                <w:rFonts w:ascii="Consolas" w:cs="Consolas" w:eastAsia="Consolas" w:hAnsi="Consolas"/>
+                <w:b w:val="false"/>
+                <w:bCs w:val="false"/>
+                <w:color w:val="4A6358"/>
+                <w:sz w:val="17"/>
+                <w:szCs w:val="17"/>
+              </w:rPr>
+              <w:t xml:space="preserve">TIMESTAMP</w:t>
+            </w:r>
+          </w:p>
+        </w:tc>
+        <w:tc>
+          <w:tcPr>
+            <w:tcW w:type="dxa" w:w="5000"/>
+            <w:tcBorders>
+              <w:top w:val="single" w:color="C8E6D4" w:sz="4"/>
+              <w:left w:val="single" w:color="C8E6D4" w:sz="4"/>
+              <w:bottom w:val="single" w:color="C8E6D4" w:sz="4"/>
+              <w:right w:val="single" w:color="C8E6D4" w:sz="4"/>
+            </w:tcBorders>
+            <w:shd w:fill="FFFFFF" w:val="clear"/>
+            <w:tcMar>
+              <w:top w:type="dxa" w:w="80"/>
+              <w:left w:type="dxa" w:w="120"/>
+              <w:bottom w:type="dxa" w:w="80"/>
+              <w:right w:type="dxa" w:w="120"/>
+            </w:tcMar>
+            <w:vAlign w:val="center"/>
+          </w:tcPr>
+          <w:p>
+            <w:r>
+              <w:rPr>
+                <w:rFonts w:ascii="Arial" w:cs="Arial" w:eastAsia="Arial" w:hAnsi="Arial"/>
+                <w:b w:val="false"/>
+                <w:bCs w:val="false"/>
+                <w:color w:val="1A2E22"/>
+                <w:sz w:val="17"/>
+                <w:szCs w:val="17"/>
+              </w:rPr>
+              <w:t xml:space="preserve">Data e hora da última alteração (preenchida por trigger)</w:t>
             </w:r>
           </w:p>
         </w:tc>
@@ -1776,6 +1874,104 @@
           </w:p>
         </w:tc>
       </w:tr>
+      <w:tr>
+        <w:tc>
+          <w:tcPr>
+            <w:tcW w:type="dxa" w:w="1900"/>
+            <w:tcBorders>
+              <w:top w:val="single" w:color="C8E6D4" w:sz="4"/>
+              <w:left w:val="single" w:color="C8E6D4" w:sz="4"/>
+              <w:bottom w:val="single" w:color="C8E6D4" w:sz="4"/>
+              <w:right w:val="single" w:color="C8E6D4" w:sz="4"/>
+            </w:tcBorders>
+            <w:shd w:fill="FFFFFF" w:val="clear"/>
+            <w:tcMar>
+              <w:top w:type="dxa" w:w="80"/>
+              <w:left w:type="dxa" w:w="120"/>
+              <w:bottom w:type="dxa" w:w="80"/>
+              <w:right w:type="dxa" w:w="120"/>
+            </w:tcMar>
+            <w:vAlign w:val="center"/>
+          </w:tcPr>
+          <w:p>
+            <w:r>
+              <w:rPr>
+                <w:rFonts w:ascii="Consolas" w:cs="Consolas" w:eastAsia="Consolas" w:hAnsi="Consolas"/>
+                <w:b/>
+                <w:bCs/>
+                <w:color w:val="2D6A4F"/>
+                <w:sz w:val="17"/>
+                <w:szCs w:val="17"/>
+              </w:rPr>
+              <w:t xml:space="preserve">atualizado_em</w:t>
+            </w:r>
+          </w:p>
+        </w:tc>
+        <w:tc>
+          <w:tcPr>
+            <w:tcW w:type="dxa" w:w="1900"/>
+            <w:tcBorders>
+              <w:top w:val="single" w:color="C8E6D4" w:sz="4"/>
+              <w:left w:val="single" w:color="C8E6D4" w:sz="4"/>
+              <w:bottom w:val="single" w:color="C8E6D4" w:sz="4"/>
+              <w:right w:val="single" w:color="C8E6D4" w:sz="4"/>
+            </w:tcBorders>
+            <w:shd w:fill="FFFFFF" w:val="clear"/>
+            <w:tcMar>
+              <w:top w:type="dxa" w:w="80"/>
+              <w:left w:type="dxa" w:w="120"/>
+              <w:bottom w:type="dxa" w:w="80"/>
+              <w:right w:type="dxa" w:w="120"/>
+            </w:tcMar>
+            <w:vAlign w:val="center"/>
+          </w:tcPr>
+          <w:p>
+            <w:r>
+              <w:rPr>
+                <w:rFonts w:ascii="Consolas" w:cs="Consolas" w:eastAsia="Consolas" w:hAnsi="Consolas"/>
+                <w:b w:val="false"/>
+                <w:bCs w:val="false"/>
+                <w:color w:val="4A6358"/>
+                <w:sz w:val="17"/>
+                <w:szCs w:val="17"/>
+              </w:rPr>
+              <w:t xml:space="preserve">TIMESTAMP</w:t>
+            </w:r>
+          </w:p>
+        </w:tc>
+        <w:tc>
+          <w:tcPr>
+            <w:tcW w:type="dxa" w:w="5000"/>
+            <w:tcBorders>
+              <w:top w:val="single" w:color="C8E6D4" w:sz="4"/>
+              <w:left w:val="single" w:color="C8E6D4" w:sz="4"/>
+              <w:bottom w:val="single" w:color="C8E6D4" w:sz="4"/>
+              <w:right w:val="single" w:color="C8E6D4" w:sz="4"/>
+            </w:tcBorders>
+            <w:shd w:fill="FFFFFF" w:val="clear"/>
+            <w:tcMar>
+              <w:top w:type="dxa" w:w="80"/>
+              <w:left w:type="dxa" w:w="120"/>
+              <w:bottom w:type="dxa" w:w="80"/>
+              <w:right w:type="dxa" w:w="120"/>
+            </w:tcMar>
+            <w:vAlign w:val="center"/>
+          </w:tcPr>
+          <w:p>
+            <w:r>
+              <w:rPr>
+                <w:rFonts w:ascii="Arial" w:cs="Arial" w:eastAsia="Arial" w:hAnsi="Arial"/>
+                <w:b w:val="false"/>
+                <w:bCs w:val="false"/>
+                <w:color w:val="1A2E22"/>
+                <w:sz w:val="17"/>
+                <w:szCs w:val="17"/>
+              </w:rPr>
+              <w:t xml:space="preserve">Data e hora da última alteração (preenchida por trigger)</w:t>
+            </w:r>
+          </w:p>
+        </w:tc>
+      </w:tr>
     </w:tbl>
     <w:p>
       <w:pPr>
@@ -2072,6 +2268,22 @@
           <w:sz w:val="18"/>
           <w:szCs w:val="18"/>
         </w:rPr>
+        <w:t xml:space="preserve">   │       atualizado_em      TIMESTAMP │</w:t>
+      </w:r>
+    </w:p>
+    <w:p>
+      <w:pPr>
+        <w:shd w:fill="F4FAF6" w:val="clear"/>
+        <w:spacing w:after="0" w:before="0"/>
+        <w:ind w:left="200"/>
+      </w:pPr>
+      <w:r>
+        <w:rPr>
+          <w:rFonts w:ascii="Consolas" w:cs="Consolas" w:eastAsia="Consolas" w:hAnsi="Consolas"/>
+          <w:color w:val="1A3A2A"/>
+          <w:sz w:val="18"/>
+          <w:szCs w:val="18"/>
+        </w:rPr>
         <w:t xml:space="preserve">   └─────────────────┬──────────────────┘</w:t>
       </w:r>
     </w:p>
@@ -2297,6 +2509,22 @@
           <w:szCs w:val="18"/>
         </w:rPr>
         <w:t xml:space="preserve">   │       criado_em          TIMESTAMP │</w:t>
+      </w:r>
+    </w:p>
+    <w:p>
+      <w:pPr>
+        <w:shd w:fill="F4FAF6" w:val="clear"/>
+        <w:spacing w:after="0" w:before="0"/>
+        <w:ind w:left="200"/>
+      </w:pPr>
+      <w:r>
+        <w:rPr>
+          <w:rFonts w:ascii="Consolas" w:cs="Consolas" w:eastAsia="Consolas" w:hAnsi="Consolas"/>
+          <w:color w:val="1A3A2A"/>
+          <w:sz w:val="18"/>
+          <w:szCs w:val="18"/>
+        </w:rPr>
+        <w:t xml:space="preserve">   │       atualizado_em      TIMESTAMP │</w:t>
       </w:r>
     </w:p>
     <w:p>
@@ -2379,55 +2607,119 @@
           <w:sz w:val="18"/>
           <w:szCs w:val="18"/>
         </w:rPr>
-        <w:t xml:space="preserve">    id         SERIAL PRIMARY KEY,</w:t>
-      </w:r>
-    </w:p>
-    <w:p>
-      <w:pPr>
-        <w:shd w:fill="F4FAF6" w:val="clear"/>
-        <w:spacing w:after="0" w:before="0"/>
-        <w:ind w:left="200"/>
-      </w:pPr>
-      <w:r>
-        <w:rPr>
-          <w:rFonts w:ascii="Consolas" w:cs="Consolas" w:eastAsia="Consolas" w:hAnsi="Consolas"/>
-          <w:color w:val="1A3A2A"/>
-          <w:sz w:val="18"/>
-          <w:szCs w:val="18"/>
-        </w:rPr>
-        <w:t xml:space="preserve">    nome       VARCHAR(50) NOT NULL UNIQUE,</w:t>
-      </w:r>
-    </w:p>
-    <w:p>
-      <w:pPr>
-        <w:shd w:fill="F4FAF6" w:val="clear"/>
-        <w:spacing w:after="0" w:before="0"/>
-        <w:ind w:left="200"/>
-      </w:pPr>
-      <w:r>
-        <w:rPr>
-          <w:rFonts w:ascii="Consolas" w:cs="Consolas" w:eastAsia="Consolas" w:hAnsi="Consolas"/>
-          <w:color w:val="1A3A2A"/>
-          <w:sz w:val="18"/>
-          <w:szCs w:val="18"/>
-        </w:rPr>
-        <w:t xml:space="preserve">    icone      VARCHAR(10),</w:t>
-      </w:r>
-    </w:p>
-    <w:p>
-      <w:pPr>
-        <w:shd w:fill="F4FAF6" w:val="clear"/>
-        <w:spacing w:after="0" w:before="0"/>
-        <w:ind w:left="200"/>
-      </w:pPr>
-      <w:r>
-        <w:rPr>
-          <w:rFonts w:ascii="Consolas" w:cs="Consolas" w:eastAsia="Consolas" w:hAnsi="Consolas"/>
-          <w:color w:val="1A3A2A"/>
-          <w:sz w:val="18"/>
-          <w:szCs w:val="18"/>
-        </w:rPr>
-        <w:t xml:space="preserve">    criado_em  TIMESTAMP DEFAULT CURRENT_TIMESTAMP</w:t>
+        <w:t xml:space="preserve">    id             SERIAL PRIMARY KEY,</w:t>
+      </w:r>
+    </w:p>
+    <w:p>
+      <w:pPr>
+        <w:shd w:fill="F4FAF6" w:val="clear"/>
+        <w:spacing w:after="0" w:before="0"/>
+        <w:ind w:left="200"/>
+      </w:pPr>
+      <w:r>
+        <w:rPr>
+          <w:rFonts w:ascii="Consolas" w:cs="Consolas" w:eastAsia="Consolas" w:hAnsi="Consolas"/>
+          <w:color w:val="1A3A2A"/>
+          <w:sz w:val="18"/>
+          <w:szCs w:val="18"/>
+        </w:rPr>
+        <w:t xml:space="preserve">    nome           VARCHAR(50) NOT NULL UNIQUE,</w:t>
+      </w:r>
+    </w:p>
+    <w:p>
+      <w:pPr>
+        <w:shd w:fill="F4FAF6" w:val="clear"/>
+        <w:spacing w:after="0" w:before="0"/>
+        <w:ind w:left="200"/>
+      </w:pPr>
+      <w:r>
+        <w:rPr>
+          <w:rFonts w:ascii="Consolas" w:cs="Consolas" w:eastAsia="Consolas" w:hAnsi="Consolas"/>
+          <w:color w:val="1A3A2A"/>
+          <w:sz w:val="18"/>
+          <w:szCs w:val="18"/>
+        </w:rPr>
+        <w:t xml:space="preserve">    icone          VARCHAR(10),</w:t>
+      </w:r>
+    </w:p>
+    <w:p>
+      <w:pPr>
+        <w:shd w:fill="F4FAF6" w:val="clear"/>
+        <w:spacing w:after="0" w:before="0"/>
+        <w:ind w:left="200"/>
+      </w:pPr>
+      <w:r>
+        <w:rPr>
+          <w:rFonts w:ascii="Consolas" w:cs="Consolas" w:eastAsia="Consolas" w:hAnsi="Consolas"/>
+          <w:color w:val="1A3A2A"/>
+          <w:sz w:val="18"/>
+          <w:szCs w:val="18"/>
+        </w:rPr>
+        <w:t xml:space="preserve">    criado_em      TIMESTAMP DEFAULT CURRENT_TIMESTAMP,</w:t>
+      </w:r>
+    </w:p>
+    <w:p>
+      <w:pPr>
+        <w:shd w:fill="F4FAF6" w:val="clear"/>
+        <w:spacing w:after="0" w:before="0"/>
+        <w:ind w:left="200"/>
+      </w:pPr>
+      <w:r>
+        <w:rPr>
+          <w:rFonts w:ascii="Consolas" w:cs="Consolas" w:eastAsia="Consolas" w:hAnsi="Consolas"/>
+          <w:color w:val="1A3A2A"/>
+          <w:sz w:val="18"/>
+          <w:szCs w:val="18"/>
+        </w:rPr>
+        <w:t xml:space="preserve">    atualizado_em  TIMESTAMP DEFAULT CURRENT_TIMESTAMP,</w:t>
+      </w:r>
+    </w:p>
+    <w:p>
+      <w:pPr>
+        <w:shd w:fill="F4FAF6" w:val="clear"/>
+        <w:spacing w:after="0" w:before="0"/>
+        <w:ind w:left="200"/>
+      </w:pPr>
+      <w:r>
+        <w:rPr>
+          <w:rFonts w:ascii="Consolas" w:cs="Consolas" w:eastAsia="Consolas" w:hAnsi="Consolas"/>
+          <w:color w:val="1A3A2A"/>
+          <w:sz w:val="18"/>
+          <w:szCs w:val="18"/>
+        </w:rPr>
+        <w:t xml:space="preserve"> </w:t>
+      </w:r>
+    </w:p>
+    <w:p>
+      <w:pPr>
+        <w:shd w:fill="F4FAF6" w:val="clear"/>
+        <w:spacing w:after="0" w:before="0"/>
+        <w:ind w:left="200"/>
+      </w:pPr>
+      <w:r>
+        <w:rPr>
+          <w:rFonts w:ascii="Consolas" w:cs="Consolas" w:eastAsia="Consolas" w:hAnsi="Consolas"/>
+          <w:color w:val="1A3A2A"/>
+          <w:sz w:val="18"/>
+          <w:szCs w:val="18"/>
+        </w:rPr>
+        <w:t xml:space="preserve">    CONSTRAINT chk_categoria_nome_vazio</w:t>
+      </w:r>
+    </w:p>
+    <w:p>
+      <w:pPr>
+        <w:shd w:fill="F4FAF6" w:val="clear"/>
+        <w:spacing w:after="0" w:before="0"/>
+        <w:ind w:left="200"/>
+      </w:pPr>
+      <w:r>
+        <w:rPr>
+          <w:rFonts w:ascii="Consolas" w:cs="Consolas" w:eastAsia="Consolas" w:hAnsi="Consolas"/>
+          <w:color w:val="1A3A2A"/>
+          <w:sz w:val="18"/>
+          <w:szCs w:val="18"/>
+        </w:rPr>
+        <w:t xml:space="preserve">        CHECK (LENGTH(TRIM(nome)) &gt; 0)</w:t>
       </w:r>
     </w:p>
     <w:p>
@@ -2619,6 +2911,22 @@
           <w:sz w:val="18"/>
           <w:szCs w:val="18"/>
         </w:rPr>
+        <w:t xml:space="preserve">    atualizado_em        TIMESTAMP DEFAULT CURRENT_TIMESTAMP,</w:t>
+      </w:r>
+    </w:p>
+    <w:p>
+      <w:pPr>
+        <w:shd w:fill="F4FAF6" w:val="clear"/>
+        <w:spacing w:after="0" w:before="0"/>
+        <w:ind w:left="200"/>
+      </w:pPr>
+      <w:r>
+        <w:rPr>
+          <w:rFonts w:ascii="Consolas" w:cs="Consolas" w:eastAsia="Consolas" w:hAnsi="Consolas"/>
+          <w:color w:val="1A3A2A"/>
+          <w:sz w:val="18"/>
+          <w:szCs w:val="18"/>
+        </w:rPr>
         <w:t xml:space="preserve"> </w:t>
       </w:r>
     </w:p>
@@ -2683,7 +2991,215 @@
           <w:sz w:val="18"/>
           <w:szCs w:val="18"/>
         </w:rPr>
-        <w:t xml:space="preserve">        ON DELETE RESTRICT</w:t>
+        <w:t xml:space="preserve">        ON DELETE RESTRICT,</w:t>
+      </w:r>
+    </w:p>
+    <w:p>
+      <w:pPr>
+        <w:shd w:fill="F4FAF6" w:val="clear"/>
+        <w:spacing w:after="0" w:before="0"/>
+        <w:ind w:left="200"/>
+      </w:pPr>
+      <w:r>
+        <w:rPr>
+          <w:rFonts w:ascii="Consolas" w:cs="Consolas" w:eastAsia="Consolas" w:hAnsi="Consolas"/>
+          <w:color w:val="1A3A2A"/>
+          <w:sz w:val="18"/>
+          <w:szCs w:val="18"/>
+        </w:rPr>
+        <w:t xml:space="preserve"> </w:t>
+      </w:r>
+    </w:p>
+    <w:p>
+      <w:pPr>
+        <w:shd w:fill="F4FAF6" w:val="clear"/>
+        <w:spacing w:after="0" w:before="0"/>
+        <w:ind w:left="200"/>
+      </w:pPr>
+      <w:r>
+        <w:rPr>
+          <w:rFonts w:ascii="Consolas" w:cs="Consolas" w:eastAsia="Consolas" w:hAnsi="Consolas"/>
+          <w:color w:val="1A3A2A"/>
+          <w:sz w:val="18"/>
+          <w:szCs w:val="18"/>
+        </w:rPr>
+        <w:t xml:space="preserve">    CONSTRAINT chk_alimento_nome_vazio</w:t>
+      </w:r>
+    </w:p>
+    <w:p>
+      <w:pPr>
+        <w:shd w:fill="F4FAF6" w:val="clear"/>
+        <w:spacing w:after="0" w:before="0"/>
+        <w:ind w:left="200"/>
+      </w:pPr>
+      <w:r>
+        <w:rPr>
+          <w:rFonts w:ascii="Consolas" w:cs="Consolas" w:eastAsia="Consolas" w:hAnsi="Consolas"/>
+          <w:color w:val="1A3A2A"/>
+          <w:sz w:val="18"/>
+          <w:szCs w:val="18"/>
+        </w:rPr>
+        <w:t xml:space="preserve">        CHECK (LENGTH(TRIM(nome)) &gt; 0),</w:t>
+      </w:r>
+    </w:p>
+    <w:p>
+      <w:pPr>
+        <w:shd w:fill="F4FAF6" w:val="clear"/>
+        <w:spacing w:after="0" w:before="0"/>
+        <w:ind w:left="200"/>
+      </w:pPr>
+      <w:r>
+        <w:rPr>
+          <w:rFonts w:ascii="Consolas" w:cs="Consolas" w:eastAsia="Consolas" w:hAnsi="Consolas"/>
+          <w:color w:val="1A3A2A"/>
+          <w:sz w:val="18"/>
+          <w:szCs w:val="18"/>
+        </w:rPr>
+        <w:t xml:space="preserve"> </w:t>
+      </w:r>
+    </w:p>
+    <w:p>
+      <w:pPr>
+        <w:shd w:fill="F4FAF6" w:val="clear"/>
+        <w:spacing w:after="0" w:before="0"/>
+        <w:ind w:left="200"/>
+      </w:pPr>
+      <w:r>
+        <w:rPr>
+          <w:rFonts w:ascii="Consolas" w:cs="Consolas" w:eastAsia="Consolas" w:hAnsi="Consolas"/>
+          <w:color w:val="1A3A2A"/>
+          <w:sz w:val="18"/>
+          <w:szCs w:val="18"/>
+        </w:rPr>
+        <w:t xml:space="preserve">    CONSTRAINT chk_alimento_quantidade</w:t>
+      </w:r>
+    </w:p>
+    <w:p>
+      <w:pPr>
+        <w:shd w:fill="F4FAF6" w:val="clear"/>
+        <w:spacing w:after="0" w:before="0"/>
+        <w:ind w:left="200"/>
+      </w:pPr>
+      <w:r>
+        <w:rPr>
+          <w:rFonts w:ascii="Consolas" w:cs="Consolas" w:eastAsia="Consolas" w:hAnsi="Consolas"/>
+          <w:color w:val="1A3A2A"/>
+          <w:sz w:val="18"/>
+          <w:szCs w:val="18"/>
+        </w:rPr>
+        <w:t xml:space="preserve">        CHECK (quantidade &gt; 0)</w:t>
+      </w:r>
+    </w:p>
+    <w:p>
+      <w:pPr>
+        <w:shd w:fill="F4FAF6" w:val="clear"/>
+        <w:spacing w:after="0" w:before="0"/>
+        <w:ind w:left="200"/>
+      </w:pPr>
+      <w:r>
+        <w:rPr>
+          <w:rFonts w:ascii="Consolas" w:cs="Consolas" w:eastAsia="Consolas" w:hAnsi="Consolas"/>
+          <w:color w:val="1A3A2A"/>
+          <w:sz w:val="18"/>
+          <w:szCs w:val="18"/>
+        </w:rPr>
+        <w:t xml:space="preserve">);</w:t>
+      </w:r>
+    </w:p>
+    <w:p>
+      <w:pPr>
+        <w:shd w:fill="F4FAF6" w:val="clear"/>
+        <w:spacing w:after="0" w:before="0"/>
+        <w:ind w:left="200"/>
+      </w:pPr>
+      <w:r>
+        <w:rPr>
+          <w:rFonts w:ascii="Consolas" w:cs="Consolas" w:eastAsia="Consolas" w:hAnsi="Consolas"/>
+          <w:color w:val="1A3A2A"/>
+          <w:sz w:val="18"/>
+          <w:szCs w:val="18"/>
+        </w:rPr>
+        <w:t xml:space="preserve"> </w:t>
+      </w:r>
+    </w:p>
+    <w:p>
+      <w:pPr>
+        <w:shd w:fill="F4FAF6" w:val="clear"/>
+        <w:spacing w:after="0" w:before="0"/>
+        <w:ind w:left="200"/>
+      </w:pPr>
+      <w:r>
+        <w:rPr>
+          <w:rFonts w:ascii="Consolas" w:cs="Consolas" w:eastAsia="Consolas" w:hAnsi="Consolas"/>
+          <w:color w:val="1A3A2A"/>
+          <w:sz w:val="18"/>
+          <w:szCs w:val="18"/>
+        </w:rPr>
+        <w:t xml:space="preserve">-- Índices de apoio às consultas mais frequentes</w:t>
+      </w:r>
+    </w:p>
+    <w:p>
+      <w:pPr>
+        <w:shd w:fill="F4FAF6" w:val="clear"/>
+        <w:spacing w:after="0" w:before="0"/>
+        <w:ind w:left="200"/>
+      </w:pPr>
+      <w:r>
+        <w:rPr>
+          <w:rFonts w:ascii="Consolas" w:cs="Consolas" w:eastAsia="Consolas" w:hAnsi="Consolas"/>
+          <w:color w:val="1A3A2A"/>
+          <w:sz w:val="18"/>
+          <w:szCs w:val="18"/>
+        </w:rPr>
+        <w:t xml:space="preserve">CREATE INDEX idx_alimentos_categoria_id</w:t>
+      </w:r>
+    </w:p>
+    <w:p>
+      <w:pPr>
+        <w:shd w:fill="F4FAF6" w:val="clear"/>
+        <w:spacing w:after="0" w:before="0"/>
+        <w:ind w:left="200"/>
+      </w:pPr>
+      <w:r>
+        <w:rPr>
+          <w:rFonts w:ascii="Consolas" w:cs="Consolas" w:eastAsia="Consolas" w:hAnsi="Consolas"/>
+          <w:color w:val="1A3A2A"/>
+          <w:sz w:val="18"/>
+          <w:szCs w:val="18"/>
+        </w:rPr>
+        <w:t xml:space="preserve">    ON alimentos (categoria_id);</w:t>
+      </w:r>
+    </w:p>
+    <w:p>
+      <w:pPr>
+        <w:shd w:fill="F4FAF6" w:val="clear"/>
+        <w:spacing w:after="0" w:before="0"/>
+        <w:ind w:left="200"/>
+      </w:pPr>
+      <w:r>
+        <w:rPr>
+          <w:rFonts w:ascii="Consolas" w:cs="Consolas" w:eastAsia="Consolas" w:hAnsi="Consolas"/>
+          <w:color w:val="1A3A2A"/>
+          <w:sz w:val="18"/>
+          <w:szCs w:val="18"/>
+        </w:rPr>
+        <w:t xml:space="preserve"> </w:t>
+      </w:r>
+    </w:p>
+    <w:p>
+      <w:pPr>
+        <w:shd w:fill="F4FAF6" w:val="clear"/>
+        <w:spacing w:after="0" w:before="0"/>
+        <w:ind w:left="200"/>
+      </w:pPr>
+      <w:r>
+        <w:rPr>
+          <w:rFonts w:ascii="Consolas" w:cs="Consolas" w:eastAsia="Consolas" w:hAnsi="Consolas"/>
+          <w:color w:val="1A3A2A"/>
+          <w:sz w:val="18"/>
+          <w:szCs w:val="18"/>
+        </w:rPr>
+        <w:t xml:space="preserve">CREATE INDEX idx_alimentos_data_validade</w:t>
       </w:r>
     </w:p>
     <w:p>
@@ -2699,7 +3215,629 @@
           <w:sz w:val="18"/>
           <w:szCs w:val="18"/>
         </w:rPr>
-        <w:t xml:space="preserve">);</w:t>
+        <w:t xml:space="preserve">    ON alimentos (data_validade);</w:t>
+      </w:r>
+    </w:p>
+    <w:p>
+      <w:pPr>
+        <w:spacing w:after="100" w:before="240"/>
+      </w:pPr>
+      <w:r>
+        <w:rPr>
+          <w:rFonts w:ascii="Arial" w:cs="Arial" w:eastAsia="Arial" w:hAnsi="Arial"/>
+          <w:b/>
+          <w:bCs/>
+          <w:color w:val="2D6A4F"/>
+          <w:sz w:val="22"/>
+          <w:szCs w:val="22"/>
+        </w:rPr>
+        <w:t xml:space="preserve">5.1  Trigger de Auditoria</w:t>
+      </w:r>
+    </w:p>
+    <w:p>
+      <w:pPr>
+        <w:spacing w:after="160" w:line="300"/>
+        <w:jc w:val="both"/>
+      </w:pPr>
+      <w:r>
+        <w:rPr>
+          <w:rFonts w:ascii="Arial" w:cs="Arial" w:eastAsia="Arial" w:hAnsi="Arial"/>
+          <w:color w:val="1A2E22"/>
+          <w:sz w:val="20"/>
+          <w:szCs w:val="20"/>
+        </w:rPr>
+        <w:t xml:space="preserve">Para registrar automaticamente a data da última alteração de cada registro, foi criada uma função associada a gatilhos (triggers) nas duas tabelas. Dessa forma, o campo atualizado_em é preenchido pelo próprio SGBD, sem depender da aplicação.</w:t>
+      </w:r>
+    </w:p>
+    <w:p>
+      <w:pPr>
+        <w:shd w:fill="F4FAF6" w:val="clear"/>
+        <w:spacing w:after="0" w:before="80"/>
+        <w:ind w:left="200"/>
+      </w:pPr>
+      <w:r>
+        <w:rPr>
+          <w:rFonts w:ascii="Consolas" w:cs="Consolas" w:eastAsia="Consolas" w:hAnsi="Consolas"/>
+          <w:color w:val="1A3A2A"/>
+          <w:sz w:val="18"/>
+          <w:szCs w:val="18"/>
+        </w:rPr>
+        <w:t xml:space="preserve">CREATE OR REPLACE FUNCTION fn_atualiza_timestamp()</w:t>
+      </w:r>
+    </w:p>
+    <w:p>
+      <w:pPr>
+        <w:shd w:fill="F4FAF6" w:val="clear"/>
+        <w:spacing w:after="0" w:before="0"/>
+        <w:ind w:left="200"/>
+      </w:pPr>
+      <w:r>
+        <w:rPr>
+          <w:rFonts w:ascii="Consolas" w:cs="Consolas" w:eastAsia="Consolas" w:hAnsi="Consolas"/>
+          <w:color w:val="1A3A2A"/>
+          <w:sz w:val="18"/>
+          <w:szCs w:val="18"/>
+        </w:rPr>
+        <w:t xml:space="preserve">RETURNS TRIGGER AS $$</w:t>
+      </w:r>
+    </w:p>
+    <w:p>
+      <w:pPr>
+        <w:shd w:fill="F4FAF6" w:val="clear"/>
+        <w:spacing w:after="0" w:before="0"/>
+        <w:ind w:left="200"/>
+      </w:pPr>
+      <w:r>
+        <w:rPr>
+          <w:rFonts w:ascii="Consolas" w:cs="Consolas" w:eastAsia="Consolas" w:hAnsi="Consolas"/>
+          <w:color w:val="1A3A2A"/>
+          <w:sz w:val="18"/>
+          <w:szCs w:val="18"/>
+        </w:rPr>
+        <w:t xml:space="preserve">BEGIN</w:t>
+      </w:r>
+    </w:p>
+    <w:p>
+      <w:pPr>
+        <w:shd w:fill="F4FAF6" w:val="clear"/>
+        <w:spacing w:after="0" w:before="0"/>
+        <w:ind w:left="200"/>
+      </w:pPr>
+      <w:r>
+        <w:rPr>
+          <w:rFonts w:ascii="Consolas" w:cs="Consolas" w:eastAsia="Consolas" w:hAnsi="Consolas"/>
+          <w:color w:val="1A3A2A"/>
+          <w:sz w:val="18"/>
+          <w:szCs w:val="18"/>
+        </w:rPr>
+        <w:t xml:space="preserve">    NEW.atualizado_em = CURRENT_TIMESTAMP;</w:t>
+      </w:r>
+    </w:p>
+    <w:p>
+      <w:pPr>
+        <w:shd w:fill="F4FAF6" w:val="clear"/>
+        <w:spacing w:after="0" w:before="0"/>
+        <w:ind w:left="200"/>
+      </w:pPr>
+      <w:r>
+        <w:rPr>
+          <w:rFonts w:ascii="Consolas" w:cs="Consolas" w:eastAsia="Consolas" w:hAnsi="Consolas"/>
+          <w:color w:val="1A3A2A"/>
+          <w:sz w:val="18"/>
+          <w:szCs w:val="18"/>
+        </w:rPr>
+        <w:t xml:space="preserve">    RETURN NEW;</w:t>
+      </w:r>
+    </w:p>
+    <w:p>
+      <w:pPr>
+        <w:shd w:fill="F4FAF6" w:val="clear"/>
+        <w:spacing w:after="0" w:before="0"/>
+        <w:ind w:left="200"/>
+      </w:pPr>
+      <w:r>
+        <w:rPr>
+          <w:rFonts w:ascii="Consolas" w:cs="Consolas" w:eastAsia="Consolas" w:hAnsi="Consolas"/>
+          <w:color w:val="1A3A2A"/>
+          <w:sz w:val="18"/>
+          <w:szCs w:val="18"/>
+        </w:rPr>
+        <w:t xml:space="preserve">END;</w:t>
+      </w:r>
+    </w:p>
+    <w:p>
+      <w:pPr>
+        <w:shd w:fill="F4FAF6" w:val="clear"/>
+        <w:spacing w:after="0" w:before="0"/>
+        <w:ind w:left="200"/>
+      </w:pPr>
+      <w:r>
+        <w:rPr>
+          <w:rFonts w:ascii="Consolas" w:cs="Consolas" w:eastAsia="Consolas" w:hAnsi="Consolas"/>
+          <w:color w:val="1A3A2A"/>
+          <w:sz w:val="18"/>
+          <w:szCs w:val="18"/>
+        </w:rPr>
+        <w:t xml:space="preserve">$$ LANGUAGE plpgsql;</w:t>
+      </w:r>
+    </w:p>
+    <w:p>
+      <w:pPr>
+        <w:shd w:fill="F4FAF6" w:val="clear"/>
+        <w:spacing w:after="0" w:before="0"/>
+        <w:ind w:left="200"/>
+      </w:pPr>
+      <w:r>
+        <w:rPr>
+          <w:rFonts w:ascii="Consolas" w:cs="Consolas" w:eastAsia="Consolas" w:hAnsi="Consolas"/>
+          <w:color w:val="1A3A2A"/>
+          <w:sz w:val="18"/>
+          <w:szCs w:val="18"/>
+        </w:rPr>
+        <w:t xml:space="preserve"> </w:t>
+      </w:r>
+    </w:p>
+    <w:p>
+      <w:pPr>
+        <w:shd w:fill="F4FAF6" w:val="clear"/>
+        <w:spacing w:after="0" w:before="0"/>
+        <w:ind w:left="200"/>
+      </w:pPr>
+      <w:r>
+        <w:rPr>
+          <w:rFonts w:ascii="Consolas" w:cs="Consolas" w:eastAsia="Consolas" w:hAnsi="Consolas"/>
+          <w:color w:val="1A3A2A"/>
+          <w:sz w:val="18"/>
+          <w:szCs w:val="18"/>
+        </w:rPr>
+        <w:t xml:space="preserve">CREATE TRIGGER trg_alimentos_atualizado_em</w:t>
+      </w:r>
+    </w:p>
+    <w:p>
+      <w:pPr>
+        <w:shd w:fill="F4FAF6" w:val="clear"/>
+        <w:spacing w:after="0" w:before="0"/>
+        <w:ind w:left="200"/>
+      </w:pPr>
+      <w:r>
+        <w:rPr>
+          <w:rFonts w:ascii="Consolas" w:cs="Consolas" w:eastAsia="Consolas" w:hAnsi="Consolas"/>
+          <w:color w:val="1A3A2A"/>
+          <w:sz w:val="18"/>
+          <w:szCs w:val="18"/>
+        </w:rPr>
+        <w:t xml:space="preserve">    BEFORE UPDATE ON alimentos</w:t>
+      </w:r>
+    </w:p>
+    <w:p>
+      <w:pPr>
+        <w:shd w:fill="F4FAF6" w:val="clear"/>
+        <w:spacing w:after="0" w:before="0"/>
+        <w:ind w:left="200"/>
+      </w:pPr>
+      <w:r>
+        <w:rPr>
+          <w:rFonts w:ascii="Consolas" w:cs="Consolas" w:eastAsia="Consolas" w:hAnsi="Consolas"/>
+          <w:color w:val="1A3A2A"/>
+          <w:sz w:val="18"/>
+          <w:szCs w:val="18"/>
+        </w:rPr>
+        <w:t xml:space="preserve">    FOR EACH ROW</w:t>
+      </w:r>
+    </w:p>
+    <w:p>
+      <w:pPr>
+        <w:shd w:fill="F4FAF6" w:val="clear"/>
+        <w:spacing w:after="160" w:before="0"/>
+        <w:ind w:left="200"/>
+      </w:pPr>
+      <w:r>
+        <w:rPr>
+          <w:rFonts w:ascii="Consolas" w:cs="Consolas" w:eastAsia="Consolas" w:hAnsi="Consolas"/>
+          <w:color w:val="1A3A2A"/>
+          <w:sz w:val="18"/>
+          <w:szCs w:val="18"/>
+        </w:rPr>
+        <w:t xml:space="preserve">    EXECUTE FUNCTION fn_atualiza_timestamp();</w:t>
+      </w:r>
+    </w:p>
+    <w:p>
+      <w:pPr>
+        <w:spacing w:after="100" w:before="240"/>
+      </w:pPr>
+      <w:r>
+        <w:rPr>
+          <w:rFonts w:ascii="Arial" w:cs="Arial" w:eastAsia="Arial" w:hAnsi="Arial"/>
+          <w:b/>
+          <w:bCs/>
+          <w:color w:val="2D6A4F"/>
+          <w:sz w:val="22"/>
+          <w:szCs w:val="22"/>
+        </w:rPr>
+        <w:t xml:space="preserve">5.2  Visão de Status de Vencimento</w:t>
+      </w:r>
+    </w:p>
+    <w:p>
+      <w:pPr>
+        <w:spacing w:after="160" w:line="300"/>
+        <w:jc w:val="both"/>
+      </w:pPr>
+      <w:r>
+        <w:rPr>
+          <w:rFonts w:ascii="Arial" w:cs="Arial" w:eastAsia="Arial" w:hAnsi="Arial"/>
+          <w:color w:val="1A2E22"/>
+          <w:sz w:val="20"/>
+          <w:szCs w:val="20"/>
+        </w:rPr>
+        <w:t xml:space="preserve">A regra que determina se um alimento está vencido, próximo do vencimento ou em dia foi implementada como uma visão (view) no banco de dados. Com isso, o cálculo existe em um único local e é consumido tanto pela listagem quanto pelo resumo de alertas da aplicação, evitando duplicação de lógica entre o servidor e o aplicativo.</w:t>
+      </w:r>
+    </w:p>
+    <w:p>
+      <w:pPr>
+        <w:shd w:fill="F4FAF6" w:val="clear"/>
+        <w:spacing w:after="0" w:before="80"/>
+        <w:ind w:left="200"/>
+      </w:pPr>
+      <w:r>
+        <w:rPr>
+          <w:rFonts w:ascii="Consolas" w:cs="Consolas" w:eastAsia="Consolas" w:hAnsi="Consolas"/>
+          <w:color w:val="1A3A2A"/>
+          <w:sz w:val="18"/>
+          <w:szCs w:val="18"/>
+        </w:rPr>
+        <w:t xml:space="preserve">CREATE VIEW vw_alimentos_status AS</w:t>
+      </w:r>
+    </w:p>
+    <w:p>
+      <w:pPr>
+        <w:shd w:fill="F4FAF6" w:val="clear"/>
+        <w:spacing w:after="0" w:before="0"/>
+        <w:ind w:left="200"/>
+      </w:pPr>
+      <w:r>
+        <w:rPr>
+          <w:rFonts w:ascii="Consolas" w:cs="Consolas" w:eastAsia="Consolas" w:hAnsi="Consolas"/>
+          <w:color w:val="1A3A2A"/>
+          <w:sz w:val="18"/>
+          <w:szCs w:val="18"/>
+        </w:rPr>
+        <w:t xml:space="preserve">SELECT</w:t>
+      </w:r>
+    </w:p>
+    <w:p>
+      <w:pPr>
+        <w:shd w:fill="F4FAF6" w:val="clear"/>
+        <w:spacing w:after="0" w:before="0"/>
+        <w:ind w:left="200"/>
+      </w:pPr>
+      <w:r>
+        <w:rPr>
+          <w:rFonts w:ascii="Consolas" w:cs="Consolas" w:eastAsia="Consolas" w:hAnsi="Consolas"/>
+          <w:color w:val="1A3A2A"/>
+          <w:sz w:val="18"/>
+          <w:szCs w:val="18"/>
+        </w:rPr>
+        <w:t xml:space="preserve">    a.id,</w:t>
+      </w:r>
+    </w:p>
+    <w:p>
+      <w:pPr>
+        <w:shd w:fill="F4FAF6" w:val="clear"/>
+        <w:spacing w:after="0" w:before="0"/>
+        <w:ind w:left="200"/>
+      </w:pPr>
+      <w:r>
+        <w:rPr>
+          <w:rFonts w:ascii="Consolas" w:cs="Consolas" w:eastAsia="Consolas" w:hAnsi="Consolas"/>
+          <w:color w:val="1A3A2A"/>
+          <w:sz w:val="18"/>
+          <w:szCs w:val="18"/>
+        </w:rPr>
+        <w:t xml:space="preserve">    a.nome,</w:t>
+      </w:r>
+    </w:p>
+    <w:p>
+      <w:pPr>
+        <w:shd w:fill="F4FAF6" w:val="clear"/>
+        <w:spacing w:after="0" w:before="0"/>
+        <w:ind w:left="200"/>
+      </w:pPr>
+      <w:r>
+        <w:rPr>
+          <w:rFonts w:ascii="Consolas" w:cs="Consolas" w:eastAsia="Consolas" w:hAnsi="Consolas"/>
+          <w:color w:val="1A3A2A"/>
+          <w:sz w:val="18"/>
+          <w:szCs w:val="18"/>
+        </w:rPr>
+        <w:t xml:space="preserve">    a.categoria_id,</w:t>
+      </w:r>
+    </w:p>
+    <w:p>
+      <w:pPr>
+        <w:shd w:fill="F4FAF6" w:val="clear"/>
+        <w:spacing w:after="0" w:before="0"/>
+        <w:ind w:left="200"/>
+      </w:pPr>
+      <w:r>
+        <w:rPr>
+          <w:rFonts w:ascii="Consolas" w:cs="Consolas" w:eastAsia="Consolas" w:hAnsi="Consolas"/>
+          <w:color w:val="1A3A2A"/>
+          <w:sz w:val="18"/>
+          <w:szCs w:val="18"/>
+        </w:rPr>
+        <w:t xml:space="preserve">    c.nome  AS categoria,</w:t>
+      </w:r>
+    </w:p>
+    <w:p>
+      <w:pPr>
+        <w:shd w:fill="F4FAF6" w:val="clear"/>
+        <w:spacing w:after="0" w:before="0"/>
+        <w:ind w:left="200"/>
+      </w:pPr>
+      <w:r>
+        <w:rPr>
+          <w:rFonts w:ascii="Consolas" w:cs="Consolas" w:eastAsia="Consolas" w:hAnsi="Consolas"/>
+          <w:color w:val="1A3A2A"/>
+          <w:sz w:val="18"/>
+          <w:szCs w:val="18"/>
+        </w:rPr>
+        <w:t xml:space="preserve">    c.icone AS categoria_icone,</w:t>
+      </w:r>
+    </w:p>
+    <w:p>
+      <w:pPr>
+        <w:shd w:fill="F4FAF6" w:val="clear"/>
+        <w:spacing w:after="0" w:before="0"/>
+        <w:ind w:left="200"/>
+      </w:pPr>
+      <w:r>
+        <w:rPr>
+          <w:rFonts w:ascii="Consolas" w:cs="Consolas" w:eastAsia="Consolas" w:hAnsi="Consolas"/>
+          <w:color w:val="1A3A2A"/>
+          <w:sz w:val="18"/>
+          <w:szCs w:val="18"/>
+        </w:rPr>
+        <w:t xml:space="preserve">    a.quantidade,</w:t>
+      </w:r>
+    </w:p>
+    <w:p>
+      <w:pPr>
+        <w:shd w:fill="F4FAF6" w:val="clear"/>
+        <w:spacing w:after="0" w:before="0"/>
+        <w:ind w:left="200"/>
+      </w:pPr>
+      <w:r>
+        <w:rPr>
+          <w:rFonts w:ascii="Consolas" w:cs="Consolas" w:eastAsia="Consolas" w:hAnsi="Consolas"/>
+          <w:color w:val="1A3A2A"/>
+          <w:sz w:val="18"/>
+          <w:szCs w:val="18"/>
+        </w:rPr>
+        <w:t xml:space="preserve">    a.unidade,</w:t>
+      </w:r>
+    </w:p>
+    <w:p>
+      <w:pPr>
+        <w:shd w:fill="F4FAF6" w:val="clear"/>
+        <w:spacing w:after="0" w:before="0"/>
+        <w:ind w:left="200"/>
+      </w:pPr>
+      <w:r>
+        <w:rPr>
+          <w:rFonts w:ascii="Consolas" w:cs="Consolas" w:eastAsia="Consolas" w:hAnsi="Consolas"/>
+          <w:color w:val="1A3A2A"/>
+          <w:sz w:val="18"/>
+          <w:szCs w:val="18"/>
+        </w:rPr>
+        <w:t xml:space="preserve">    a.data_validade,</w:t>
+      </w:r>
+    </w:p>
+    <w:p>
+      <w:pPr>
+        <w:shd w:fill="F4FAF6" w:val="clear"/>
+        <w:spacing w:after="0" w:before="0"/>
+        <w:ind w:left="200"/>
+      </w:pPr>
+      <w:r>
+        <w:rPr>
+          <w:rFonts w:ascii="Consolas" w:cs="Consolas" w:eastAsia="Consolas" w:hAnsi="Consolas"/>
+          <w:color w:val="1A3A2A"/>
+          <w:sz w:val="18"/>
+          <w:szCs w:val="18"/>
+        </w:rPr>
+        <w:t xml:space="preserve">    a.local_armazenamento,</w:t>
+      </w:r>
+    </w:p>
+    <w:p>
+      <w:pPr>
+        <w:shd w:fill="F4FAF6" w:val="clear"/>
+        <w:spacing w:after="0" w:before="0"/>
+        <w:ind w:left="200"/>
+      </w:pPr>
+      <w:r>
+        <w:rPr>
+          <w:rFonts w:ascii="Consolas" w:cs="Consolas" w:eastAsia="Consolas" w:hAnsi="Consolas"/>
+          <w:color w:val="1A3A2A"/>
+          <w:sz w:val="18"/>
+          <w:szCs w:val="18"/>
+        </w:rPr>
+        <w:t xml:space="preserve">    (a.data_validade - CURRENT_DATE) AS dias_para_vencer,</w:t>
+      </w:r>
+    </w:p>
+    <w:p>
+      <w:pPr>
+        <w:shd w:fill="F4FAF6" w:val="clear"/>
+        <w:spacing w:after="0" w:before="0"/>
+        <w:ind w:left="200"/>
+      </w:pPr>
+      <w:r>
+        <w:rPr>
+          <w:rFonts w:ascii="Consolas" w:cs="Consolas" w:eastAsia="Consolas" w:hAnsi="Consolas"/>
+          <w:color w:val="1A3A2A"/>
+          <w:sz w:val="18"/>
+          <w:szCs w:val="18"/>
+        </w:rPr>
+        <w:t xml:space="preserve">    CASE</w:t>
+      </w:r>
+    </w:p>
+    <w:p>
+      <w:pPr>
+        <w:shd w:fill="F4FAF6" w:val="clear"/>
+        <w:spacing w:after="0" w:before="0"/>
+        <w:ind w:left="200"/>
+      </w:pPr>
+      <w:r>
+        <w:rPr>
+          <w:rFonts w:ascii="Consolas" w:cs="Consolas" w:eastAsia="Consolas" w:hAnsi="Consolas"/>
+          <w:color w:val="1A3A2A"/>
+          <w:sz w:val="18"/>
+          <w:szCs w:val="18"/>
+        </w:rPr>
+        <w:t xml:space="preserve">        WHEN a.data_validade &lt;  CURRENT_DATE</w:t>
+      </w:r>
+    </w:p>
+    <w:p>
+      <w:pPr>
+        <w:shd w:fill="F4FAF6" w:val="clear"/>
+        <w:spacing w:after="0" w:before="0"/>
+        <w:ind w:left="200"/>
+      </w:pPr>
+      <w:r>
+        <w:rPr>
+          <w:rFonts w:ascii="Consolas" w:cs="Consolas" w:eastAsia="Consolas" w:hAnsi="Consolas"/>
+          <w:color w:val="1A3A2A"/>
+          <w:sz w:val="18"/>
+          <w:szCs w:val="18"/>
+        </w:rPr>
+        <w:t xml:space="preserve">            THEN 'vencido'</w:t>
+      </w:r>
+    </w:p>
+    <w:p>
+      <w:pPr>
+        <w:shd w:fill="F4FAF6" w:val="clear"/>
+        <w:spacing w:after="0" w:before="0"/>
+        <w:ind w:left="200"/>
+      </w:pPr>
+      <w:r>
+        <w:rPr>
+          <w:rFonts w:ascii="Consolas" w:cs="Consolas" w:eastAsia="Consolas" w:hAnsi="Consolas"/>
+          <w:color w:val="1A3A2A"/>
+          <w:sz w:val="18"/>
+          <w:szCs w:val="18"/>
+        </w:rPr>
+        <w:t xml:space="preserve">        WHEN a.data_validade &lt;= CURRENT_DATE + INTERVAL '3 day'</w:t>
+      </w:r>
+    </w:p>
+    <w:p>
+      <w:pPr>
+        <w:shd w:fill="F4FAF6" w:val="clear"/>
+        <w:spacing w:after="0" w:before="0"/>
+        <w:ind w:left="200"/>
+      </w:pPr>
+      <w:r>
+        <w:rPr>
+          <w:rFonts w:ascii="Consolas" w:cs="Consolas" w:eastAsia="Consolas" w:hAnsi="Consolas"/>
+          <w:color w:val="1A3A2A"/>
+          <w:sz w:val="18"/>
+          <w:szCs w:val="18"/>
+        </w:rPr>
+        <w:t xml:space="preserve">            THEN 'atencao'</w:t>
+      </w:r>
+    </w:p>
+    <w:p>
+      <w:pPr>
+        <w:shd w:fill="F4FAF6" w:val="clear"/>
+        <w:spacing w:after="0" w:before="0"/>
+        <w:ind w:left="200"/>
+      </w:pPr>
+      <w:r>
+        <w:rPr>
+          <w:rFonts w:ascii="Consolas" w:cs="Consolas" w:eastAsia="Consolas" w:hAnsi="Consolas"/>
+          <w:color w:val="1A3A2A"/>
+          <w:sz w:val="18"/>
+          <w:szCs w:val="18"/>
+        </w:rPr>
+        <w:t xml:space="preserve">        ELSE 'em_dia'</w:t>
+      </w:r>
+    </w:p>
+    <w:p>
+      <w:pPr>
+        <w:shd w:fill="F4FAF6" w:val="clear"/>
+        <w:spacing w:after="0" w:before="0"/>
+        <w:ind w:left="200"/>
+      </w:pPr>
+      <w:r>
+        <w:rPr>
+          <w:rFonts w:ascii="Consolas" w:cs="Consolas" w:eastAsia="Consolas" w:hAnsi="Consolas"/>
+          <w:color w:val="1A3A2A"/>
+          <w:sz w:val="18"/>
+          <w:szCs w:val="18"/>
+        </w:rPr>
+        <w:t xml:space="preserve">    END AS status,</w:t>
+      </w:r>
+    </w:p>
+    <w:p>
+      <w:pPr>
+        <w:shd w:fill="F4FAF6" w:val="clear"/>
+        <w:spacing w:after="0" w:before="0"/>
+        <w:ind w:left="200"/>
+      </w:pPr>
+      <w:r>
+        <w:rPr>
+          <w:rFonts w:ascii="Consolas" w:cs="Consolas" w:eastAsia="Consolas" w:hAnsi="Consolas"/>
+          <w:color w:val="1A3A2A"/>
+          <w:sz w:val="18"/>
+          <w:szCs w:val="18"/>
+        </w:rPr>
+        <w:t xml:space="preserve">    a.criado_em,</w:t>
+      </w:r>
+    </w:p>
+    <w:p>
+      <w:pPr>
+        <w:shd w:fill="F4FAF6" w:val="clear"/>
+        <w:spacing w:after="0" w:before="0"/>
+        <w:ind w:left="200"/>
+      </w:pPr>
+      <w:r>
+        <w:rPr>
+          <w:rFonts w:ascii="Consolas" w:cs="Consolas" w:eastAsia="Consolas" w:hAnsi="Consolas"/>
+          <w:color w:val="1A3A2A"/>
+          <w:sz w:val="18"/>
+          <w:szCs w:val="18"/>
+        </w:rPr>
+        <w:t xml:space="preserve">    a.atualizado_em</w:t>
+      </w:r>
+    </w:p>
+    <w:p>
+      <w:pPr>
+        <w:shd w:fill="F4FAF6" w:val="clear"/>
+        <w:spacing w:after="0" w:before="0"/>
+        <w:ind w:left="200"/>
+      </w:pPr>
+      <w:r>
+        <w:rPr>
+          <w:rFonts w:ascii="Consolas" w:cs="Consolas" w:eastAsia="Consolas" w:hAnsi="Consolas"/>
+          <w:color w:val="1A3A2A"/>
+          <w:sz w:val="18"/>
+          <w:szCs w:val="18"/>
+        </w:rPr>
+        <w:t xml:space="preserve">FROM alimentos a</w:t>
+      </w:r>
+    </w:p>
+    <w:p>
+      <w:pPr>
+        <w:shd w:fill="F4FAF6" w:val="clear"/>
+        <w:spacing w:after="160" w:before="0"/>
+        <w:ind w:left="200"/>
+      </w:pPr>
+      <w:r>
+        <w:rPr>
+          <w:rFonts w:ascii="Consolas" w:cs="Consolas" w:eastAsia="Consolas" w:hAnsi="Consolas"/>
+          <w:color w:val="1A3A2A"/>
+          <w:sz w:val="18"/>
+          <w:szCs w:val="18"/>
+        </w:rPr>
+        <w:t xml:space="preserve">INNER JOIN categorias c ON a.categoria_id = c.id;</w:t>
       </w:r>
     </w:p>
     <w:p>
@@ -2992,6 +4130,132 @@
     </w:p>
     <w:p>
       <w:pPr>
+        <w:spacing w:after="80" w:line="300"/>
+        <w:jc w:val="both"/>
+      </w:pPr>
+      <w:r>
+        <w:rPr>
+          <w:rFonts w:ascii="Arial" w:cs="Arial" w:eastAsia="Arial" w:hAnsi="Arial"/>
+          <w:color w:val="4A6358"/>
+          <w:sz w:val="19"/>
+          <w:szCs w:val="19"/>
+        </w:rPr>
+        <w:t xml:space="preserve">Consulta à visão de status (utilizada pela aplicação):</w:t>
+      </w:r>
+    </w:p>
+    <w:p>
+      <w:pPr>
+        <w:shd w:fill="F4FAF6" w:val="clear"/>
+        <w:spacing w:after="0" w:before="80"/>
+        <w:ind w:left="200"/>
+      </w:pPr>
+      <w:r>
+        <w:rPr>
+          <w:rFonts w:ascii="Consolas" w:cs="Consolas" w:eastAsia="Consolas" w:hAnsi="Consolas"/>
+          <w:color w:val="1A3A2A"/>
+          <w:sz w:val="18"/>
+          <w:szCs w:val="18"/>
+        </w:rPr>
+        <w:t xml:space="preserve">SELECT nome, categoria, dias_para_vencer, status</w:t>
+      </w:r>
+    </w:p>
+    <w:p>
+      <w:pPr>
+        <w:shd w:fill="F4FAF6" w:val="clear"/>
+        <w:spacing w:after="0" w:before="0"/>
+        <w:ind w:left="200"/>
+      </w:pPr>
+      <w:r>
+        <w:rPr>
+          <w:rFonts w:ascii="Consolas" w:cs="Consolas" w:eastAsia="Consolas" w:hAnsi="Consolas"/>
+          <w:color w:val="1A3A2A"/>
+          <w:sz w:val="18"/>
+          <w:szCs w:val="18"/>
+        </w:rPr>
+        <w:t xml:space="preserve">FROM vw_alimentos_status</w:t>
+      </w:r>
+    </w:p>
+    <w:p>
+      <w:pPr>
+        <w:shd w:fill="F4FAF6" w:val="clear"/>
+        <w:spacing w:after="160" w:before="0"/>
+        <w:ind w:left="200"/>
+      </w:pPr>
+      <w:r>
+        <w:rPr>
+          <w:rFonts w:ascii="Consolas" w:cs="Consolas" w:eastAsia="Consolas" w:hAnsi="Consolas"/>
+          <w:color w:val="1A3A2A"/>
+          <w:sz w:val="18"/>
+          <w:szCs w:val="18"/>
+        </w:rPr>
+        <w:t xml:space="preserve">ORDER BY data_validade ASC;</w:t>
+      </w:r>
+    </w:p>
+    <w:p>
+      <w:pPr>
+        <w:spacing w:after="80" w:line="300"/>
+        <w:jc w:val="both"/>
+      </w:pPr>
+      <w:r>
+        <w:rPr>
+          <w:rFonts w:ascii="Arial" w:cs="Arial" w:eastAsia="Arial" w:hAnsi="Arial"/>
+          <w:color w:val="4A6358"/>
+          <w:sz w:val="19"/>
+          <w:szCs w:val="19"/>
+        </w:rPr>
+        <w:t xml:space="preserve">Totais agrupados por status (utilizado no painel de alertas):</w:t>
+      </w:r>
+    </w:p>
+    <w:p>
+      <w:pPr>
+        <w:shd w:fill="F4FAF6" w:val="clear"/>
+        <w:spacing w:after="0" w:before="80"/>
+        <w:ind w:left="200"/>
+      </w:pPr>
+      <w:r>
+        <w:rPr>
+          <w:rFonts w:ascii="Consolas" w:cs="Consolas" w:eastAsia="Consolas" w:hAnsi="Consolas"/>
+          <w:color w:val="1A3A2A"/>
+          <w:sz w:val="18"/>
+          <w:szCs w:val="18"/>
+        </w:rPr>
+        <w:t xml:space="preserve">SELECT status, COUNT(*) AS total</w:t>
+      </w:r>
+    </w:p>
+    <w:p>
+      <w:pPr>
+        <w:shd w:fill="F4FAF6" w:val="clear"/>
+        <w:spacing w:after="0" w:before="0"/>
+        <w:ind w:left="200"/>
+      </w:pPr>
+      <w:r>
+        <w:rPr>
+          <w:rFonts w:ascii="Consolas" w:cs="Consolas" w:eastAsia="Consolas" w:hAnsi="Consolas"/>
+          <w:color w:val="1A3A2A"/>
+          <w:sz w:val="18"/>
+          <w:szCs w:val="18"/>
+        </w:rPr>
+        <w:t xml:space="preserve">FROM vw_alimentos_status</w:t>
+      </w:r>
+    </w:p>
+    <w:p>
+      <w:pPr>
+        <w:shd w:fill="F4FAF6" w:val="clear"/>
+        <w:spacing w:after="160" w:before="0"/>
+        <w:ind w:left="200"/>
+      </w:pPr>
+      <w:r>
+        <w:rPr>
+          <w:rFonts w:ascii="Consolas" w:cs="Consolas" w:eastAsia="Consolas" w:hAnsi="Consolas"/>
+          <w:color w:val="1A3A2A"/>
+          <w:sz w:val="18"/>
+          <w:szCs w:val="18"/>
+        </w:rPr>
+        <w:t xml:space="preserve">GROUP BY status;</w:t>
+      </w:r>
+    </w:p>
+    <w:p>
+      <w:pPr>
         <w:pBdr>
           <w:left w:val="single" w:color="2D6A4F" w:sz="18"/>
         </w:pBdr>
@@ -3153,6 +4417,84 @@
           <w:szCs w:val="20"/>
         </w:rPr>
         <w:t xml:space="preserve">Conexão criptografada: o acesso ao banco de dados é realizado por meio de conexão SSL, conforme exigido pela plataforma de hospedagem.</w:t>
+      </w:r>
+    </w:p>
+    <w:p>
+      <w:pPr>
+        <w:spacing w:after="80" w:line="300"/>
+        <w:ind w:left="400" w:hanging="200"/>
+      </w:pPr>
+      <w:r>
+        <w:rPr>
+          <w:rFonts w:ascii="Arial" w:cs="Arial" w:eastAsia="Arial" w:hAnsi="Arial"/>
+          <w:b/>
+          <w:bCs/>
+          <w:color w:val="2D6A4F"/>
+          <w:sz w:val="20"/>
+          <w:szCs w:val="20"/>
+        </w:rPr>
+        <w:t xml:space="preserve">•   </w:t>
+      </w:r>
+      <w:r>
+        <w:rPr>
+          <w:rFonts w:ascii="Arial" w:cs="Arial" w:eastAsia="Arial" w:hAnsi="Arial"/>
+          <w:color w:val="1A2E22"/>
+          <w:sz w:val="20"/>
+          <w:szCs w:val="20"/>
+        </w:rPr>
+        <w:t xml:space="preserve">Restrições CHECK: impedem o armazenamento de nomes em branco e de quantidades nulas ou negativas.</w:t>
+      </w:r>
+    </w:p>
+    <w:p>
+      <w:pPr>
+        <w:spacing w:after="80" w:line="300"/>
+        <w:ind w:left="400" w:hanging="200"/>
+      </w:pPr>
+      <w:r>
+        <w:rPr>
+          <w:rFonts w:ascii="Arial" w:cs="Arial" w:eastAsia="Arial" w:hAnsi="Arial"/>
+          <w:b/>
+          <w:bCs/>
+          <w:color w:val="2D6A4F"/>
+          <w:sz w:val="20"/>
+          <w:szCs w:val="20"/>
+        </w:rPr>
+        <w:t xml:space="preserve">•   </w:t>
+      </w:r>
+      <w:r>
+        <w:rPr>
+          <w:rFonts w:ascii="Arial" w:cs="Arial" w:eastAsia="Arial" w:hAnsi="Arial"/>
+          <w:color w:val="1A2E22"/>
+          <w:sz w:val="20"/>
+          <w:szCs w:val="20"/>
+        </w:rPr>
+        <w:t xml:space="preserve">Rastreabilidade: o campo atualizado_em, mantido por trigger, registra quando cada informação foi modificada pela última vez.</w:t>
+      </w:r>
+    </w:p>
+    <w:p>
+      <w:pPr>
+        <w:spacing w:after="80" w:line="300"/>
+        <w:ind w:left="400" w:hanging="200"/>
+      </w:pPr>
+      <w:r>
+        <w:rPr>
+          <w:rFonts w:ascii="Arial" w:cs="Arial" w:eastAsia="Arial" w:hAnsi="Arial"/>
+          <w:b/>
+          <w:bCs/>
+          <w:color w:val="2D6A4F"/>
+          <w:sz w:val="20"/>
+          <w:szCs w:val="20"/>
+        </w:rPr>
+        <w:t xml:space="preserve">•   </w:t>
+      </w:r>
+      <w:r>
+        <w:rPr>
+          <w:rFonts w:ascii="Arial" w:cs="Arial" w:eastAsia="Arial" w:hAnsi="Arial"/>
+          <w:color w:val="1A2E22"/>
+          <w:sz w:val="20"/>
+          <w:szCs w:val="20"/>
+        </w:rPr>
+        <w:t xml:space="preserve">Desempenho: índices nas colunas categoria_id e data_validade otimizam as operações de junção e a ordenação por vencimento, atendendo ao requisito não funcional de tempo de resposta.</w:t>
       </w:r>
     </w:p>
     <w:p>

</xml_diff>